<commit_message>
elimnar y agragr el informe del proyecto.
</commit_message>
<xml_diff>
--- a/documentos/informe de pryecto de software.docx
+++ b/documentos/informe de pryecto de software.docx
@@ -29,12 +29,12 @@
           <wp:inline distB="114300" distT="114300" distL="114300" distR="114300">
             <wp:extent cx="1427861" cy="1509713"/>
             <wp:effectExtent b="0" l="0" r="0" t="0"/>
-            <wp:docPr id="15" name="image9.png"/>
+            <wp:docPr id="16" name="image1.png"/>
             <a:graphic>
               <a:graphicData uri="http://schemas.openxmlformats.org/drawingml/2006/picture">
                 <pic:pic>
                   <pic:nvPicPr>
-                    <pic:cNvPr id="0" name="image9.png"/>
+                    <pic:cNvPr id="0" name="image1.png"/>
                     <pic:cNvPicPr preferRelativeResize="0"/>
                   </pic:nvPicPr>
                   <pic:blipFill>
@@ -378,7 +378,7 @@
     </w:p>
     <w:sdt>
       <w:sdtPr>
-        <w:id w:val="-331503442"/>
+        <w:id w:val="1707105952"/>
         <w:docPartObj>
           <w:docPartGallery w:val="Table of Contents"/>
           <w:docPartUnique w:val="1"/>
@@ -2541,7 +2541,7 @@
       </w:r>
       <w:sdt>
         <w:sdtPr>
-          <w:id w:val="1188360347"/>
+          <w:id w:val="462830635"/>
           <w:tag w:val="goog_rdk_0"/>
         </w:sdtPr>
         <w:sdtContent>
@@ -2550,7 +2550,7 @@
       </w:sdt>
       <w:sdt>
         <w:sdtPr>
-          <w:id w:val="-600943841"/>
+          <w:id w:val="2072915465"/>
           <w:tag w:val="goog_rdk_1"/>
         </w:sdtPr>
         <w:sdtContent>
@@ -4251,12 +4251,12 @@
           <wp:inline distB="114300" distT="114300" distL="114300" distR="114300">
             <wp:extent cx="6038850" cy="5743724"/>
             <wp:effectExtent b="0" l="0" r="0" t="0"/>
-            <wp:docPr id="4" name="image15.png"/>
+            <wp:docPr id="4" name="image16.png"/>
             <a:graphic>
               <a:graphicData uri="http://schemas.openxmlformats.org/drawingml/2006/picture">
                 <pic:pic>
                   <pic:nvPicPr>
-                    <pic:cNvPr id="0" name="image15.png"/>
+                    <pic:cNvPr id="0" name="image16.png"/>
                     <pic:cNvPicPr preferRelativeResize="0"/>
                   </pic:nvPicPr>
                   <pic:blipFill>
@@ -6954,12 +6954,12 @@
           <wp:inline distB="114300" distT="114300" distL="114300" distR="114300">
             <wp:extent cx="6100763" cy="5638800"/>
             <wp:effectExtent b="0" l="0" r="0" t="0"/>
-            <wp:docPr id="6" name="image2.png"/>
+            <wp:docPr id="6" name="image11.png"/>
             <a:graphic>
               <a:graphicData uri="http://schemas.openxmlformats.org/drawingml/2006/picture">
                 <pic:pic>
                   <pic:nvPicPr>
-                    <pic:cNvPr id="0" name="image2.png"/>
+                    <pic:cNvPr id="0" name="image11.png"/>
                     <pic:cNvPicPr preferRelativeResize="0"/>
                   </pic:nvPicPr>
                   <pic:blipFill>
@@ -7480,12 +7480,12 @@
           <wp:inline distB="114300" distT="114300" distL="114300" distR="114300">
             <wp:extent cx="6029325" cy="4279057"/>
             <wp:effectExtent b="0" l="0" r="0" t="0"/>
-            <wp:docPr id="17" name="image8.png"/>
+            <wp:docPr id="18" name="image7.png"/>
             <a:graphic>
               <a:graphicData uri="http://schemas.openxmlformats.org/drawingml/2006/picture">
                 <pic:pic>
                   <pic:nvPicPr>
-                    <pic:cNvPr id="0" name="image8.png"/>
+                    <pic:cNvPr id="0" name="image7.png"/>
                     <pic:cNvPicPr preferRelativeResize="0"/>
                   </pic:nvPicPr>
                   <pic:blipFill>
@@ -8631,12 +8631,12 @@
           <wp:inline distB="114300" distT="114300" distL="114300" distR="114300">
             <wp:extent cx="3976688" cy="2886075"/>
             <wp:effectExtent b="0" l="0" r="0" t="0"/>
-            <wp:docPr id="11" name="image14.png"/>
+            <wp:docPr id="11" name="image12.png"/>
             <a:graphic>
               <a:graphicData uri="http://schemas.openxmlformats.org/drawingml/2006/picture">
                 <pic:pic>
                   <pic:nvPicPr>
-                    <pic:cNvPr id="0" name="image14.png"/>
+                    <pic:cNvPr id="0" name="image12.png"/>
                     <pic:cNvPicPr preferRelativeResize="0"/>
                   </pic:nvPicPr>
                   <pic:blipFill>
@@ -8936,12 +8936,12 @@
           <wp:inline distB="114300" distT="114300" distL="114300" distR="114300">
             <wp:extent cx="3257550" cy="695325"/>
             <wp:effectExtent b="0" l="0" r="0" t="0"/>
-            <wp:docPr id="12" name="image3.png"/>
+            <wp:docPr id="12" name="image4.png"/>
             <a:graphic>
               <a:graphicData uri="http://schemas.openxmlformats.org/drawingml/2006/picture">
                 <pic:pic>
                   <pic:nvPicPr>
-                    <pic:cNvPr id="0" name="image3.png"/>
+                    <pic:cNvPr id="0" name="image4.png"/>
                     <pic:cNvPicPr preferRelativeResize="0"/>
                   </pic:nvPicPr>
                   <pic:blipFill>
@@ -9418,12 +9418,12 @@
           <wp:inline distB="114300" distT="114300" distL="114300" distR="114300">
             <wp:extent cx="2286000" cy="1095375"/>
             <wp:effectExtent b="0" l="0" r="0" t="0"/>
-            <wp:docPr id="3" name="image7.png"/>
+            <wp:docPr id="3" name="image15.png"/>
             <a:graphic>
               <a:graphicData uri="http://schemas.openxmlformats.org/drawingml/2006/picture">
                 <pic:pic>
                   <pic:nvPicPr>
-                    <pic:cNvPr id="0" name="image7.png"/>
+                    <pic:cNvPr id="0" name="image15.png"/>
                     <pic:cNvPicPr preferRelativeResize="0"/>
                   </pic:nvPicPr>
                   <pic:blipFill>
@@ -10143,7 +10143,7 @@
       </w:pPr>
       <w:sdt>
         <w:sdtPr>
-          <w:id w:val="2108609886"/>
+          <w:id w:val="-1040134153"/>
           <w:tag w:val="goog_rdk_2"/>
         </w:sdtPr>
         <w:sdtContent>
@@ -10348,12 +10348,12 @@
           <wp:inline distB="114300" distT="114300" distL="114300" distR="114300">
             <wp:extent cx="2500313" cy="2057400"/>
             <wp:effectExtent b="0" l="0" r="0" t="0"/>
-            <wp:docPr id="9" name="image11.png"/>
+            <wp:docPr id="9" name="image5.png"/>
             <a:graphic>
               <a:graphicData uri="http://schemas.openxmlformats.org/drawingml/2006/picture">
                 <pic:pic>
                   <pic:nvPicPr>
-                    <pic:cNvPr id="0" name="image11.png"/>
+                    <pic:cNvPr id="0" name="image5.png"/>
                     <pic:cNvPicPr preferRelativeResize="0"/>
                   </pic:nvPicPr>
                   <pic:blipFill>
@@ -14871,12 +14871,12 @@
           <wp:inline distB="114300" distT="114300" distL="114300" distR="114300">
             <wp:extent cx="5274000" cy="5029200"/>
             <wp:effectExtent b="0" l="0" r="0" t="0"/>
-            <wp:docPr id="10" name="image6.png"/>
+            <wp:docPr id="10" name="image3.png"/>
             <a:graphic>
               <a:graphicData uri="http://schemas.openxmlformats.org/drawingml/2006/picture">
                 <pic:pic>
                   <pic:nvPicPr>
-                    <pic:cNvPr id="0" name="image6.png"/>
+                    <pic:cNvPr id="0" name="image3.png"/>
                     <pic:cNvPicPr preferRelativeResize="0"/>
                   </pic:nvPicPr>
                   <pic:blipFill>
@@ -15020,12 +15020,12 @@
           <wp:inline distB="114300" distT="114300" distL="114300" distR="114300">
             <wp:extent cx="4724400" cy="4724400"/>
             <wp:effectExtent b="0" l="0" r="0" t="0"/>
-            <wp:docPr id="5" name="image5.png"/>
+            <wp:docPr id="5" name="image13.png"/>
             <a:graphic>
               <a:graphicData uri="http://schemas.openxmlformats.org/drawingml/2006/picture">
                 <pic:pic>
                   <pic:nvPicPr>
-                    <pic:cNvPr id="0" name="image5.png"/>
+                    <pic:cNvPr id="0" name="image13.png"/>
                     <pic:cNvPicPr preferRelativeResize="0"/>
                   </pic:nvPicPr>
                   <pic:blipFill>
@@ -17328,12 +17328,12 @@
           <wp:inline distB="114300" distT="114300" distL="114300" distR="114300">
             <wp:extent cx="2714625" cy="2029792"/>
             <wp:effectExtent b="0" l="0" r="0" t="0"/>
-            <wp:docPr id="13" name="image10.png"/>
+            <wp:docPr id="14" name="image2.png"/>
             <a:graphic>
               <a:graphicData uri="http://schemas.openxmlformats.org/drawingml/2006/picture">
                 <pic:pic>
                   <pic:nvPicPr>
-                    <pic:cNvPr id="0" name="image10.png"/>
+                    <pic:cNvPr id="0" name="image2.png"/>
                     <pic:cNvPicPr preferRelativeResize="0"/>
                   </pic:nvPicPr>
                   <pic:blipFill>
@@ -17797,12 +17797,12 @@
           <wp:inline distB="114300" distT="114300" distL="114300" distR="114300">
             <wp:extent cx="4014788" cy="2743200"/>
             <wp:effectExtent b="0" l="0" r="0" t="0"/>
-            <wp:docPr id="14" name="image13.png"/>
+            <wp:docPr id="15" name="image8.png"/>
             <a:graphic>
               <a:graphicData uri="http://schemas.openxmlformats.org/drawingml/2006/picture">
                 <pic:pic>
                   <pic:nvPicPr>
-                    <pic:cNvPr id="0" name="image13.png"/>
+                    <pic:cNvPr id="0" name="image8.png"/>
                     <pic:cNvPicPr preferRelativeResize="0"/>
                   </pic:nvPicPr>
                   <pic:blipFill>
@@ -18096,12 +18096,12 @@
           <wp:inline distB="114300" distT="114300" distL="114300" distR="114300">
             <wp:extent cx="5274000" cy="1524000"/>
             <wp:effectExtent b="0" l="0" r="0" t="0"/>
-            <wp:docPr id="7" name="image4.png"/>
+            <wp:docPr id="7" name="image10.png"/>
             <a:graphic>
               <a:graphicData uri="http://schemas.openxmlformats.org/drawingml/2006/picture">
                 <pic:pic>
                   <pic:nvPicPr>
-                    <pic:cNvPr id="0" name="image4.png"/>
+                    <pic:cNvPr id="0" name="image10.png"/>
                     <pic:cNvPicPr preferRelativeResize="0"/>
                   </pic:nvPicPr>
                   <pic:blipFill>
@@ -20774,12 +20774,12 @@
           <wp:inline distB="114300" distT="114300" distL="114300" distR="114300">
             <wp:extent cx="1638300" cy="1724025"/>
             <wp:effectExtent b="0" l="0" r="0" t="0"/>
-            <wp:docPr id="16" name="image12.png"/>
+            <wp:docPr id="17" name="image9.png"/>
             <a:graphic>
               <a:graphicData uri="http://schemas.openxmlformats.org/drawingml/2006/picture">
                 <pic:pic>
                   <pic:nvPicPr>
-                    <pic:cNvPr id="0" name="image12.png"/>
+                    <pic:cNvPr id="0" name="image9.png"/>
                     <pic:cNvPicPr preferRelativeResize="0"/>
                   </pic:nvPicPr>
                   <pic:blipFill>
@@ -20856,73 +20856,79 @@
           <w:rtl w:val="0"/>
         </w:rPr>
         <w:t xml:space="preserve">Seguimos con las diferentes pantallas que conforman las vistas para los usuarios, como ser  pantallas de registro y login, creación de subasta y demás, que se anuncian a continuación: </w:t>
+      </w:r>
+    </w:p>
+    <w:p>
+      <w:pPr>
+        <w:pStyle w:val="Heading3"/>
+        <w:rPr>
+          <w:rFonts w:ascii="Arial" w:cs="Arial" w:eastAsia="Arial" w:hAnsi="Arial"/>
+          <w:b w:val="0"/>
+          <w:bCs w:val="0"/>
+          <w:sz w:val="24"/>
+          <w:szCs w:val="24"/>
+          <w:highlight w:val="white"/>
+        </w:rPr>
+      </w:pPr>
+      <w:bookmarkStart w:colFirst="0" w:colLast="0" w:name="_heading=h.2cxknqwzcr3u" w:id="86"/>
+      <w:bookmarkEnd w:id="86"/>
+      <w:r>
+        <w:rPr>
+          <w:rFonts w:ascii="Arial" w:cs="Arial" w:eastAsia="Arial" w:hAnsi="Arial"/>
+          <w:b w:val="0"/>
+          <w:bCs w:val="0"/>
+          <w:sz w:val="24"/>
+          <w:szCs w:val="24"/>
+          <w:rtl w:val="0"/>
+        </w:rPr>
+        <w:t xml:space="preserve">Pero para implementarlo necesitamos instalar </w:t>
+      </w:r>
+      <w:r>
+        <w:rPr>
+          <w:rFonts w:ascii="Arial" w:cs="Arial" w:eastAsia="Arial" w:hAnsi="Arial"/>
+          <w:b w:val="0"/>
+          <w:bCs w:val="0"/>
+          <w:sz w:val="24"/>
+          <w:szCs w:val="24"/>
+          <w:highlight w:val="white"/>
+          <w:rtl w:val="0"/>
+        </w:rPr>
+        <w:t xml:space="preserve">react-router-dom ya que react no trae ruteo nativo,  y react-router-dom es una biblioteca estándar  de facto que implementa navegación SPA en el cliente.  Osea es lo que me permite ir de la pantalla  home a crear subasta sin tener que estar recargando la página. Y esta misma debe implementarse para comodidad del usuario.</w:t>
+      </w:r>
+      <w:r>
+        <w:rPr>
+          <w:rFonts w:ascii="Arial" w:cs="Arial" w:eastAsia="Arial" w:hAnsi="Arial"/>
+          <w:sz w:val="24"/>
+          <w:szCs w:val="24"/>
+          <w:highlight w:val="white"/>
+          <w:rtl w:val="0"/>
+        </w:rPr>
+        <w:t xml:space="preserve"> </w:t>
         <w:br w:type="textWrapping"/>
       </w:r>
-    </w:p>
-    <w:p>
-      <w:pPr>
-        <w:rPr>
-          <w:rFonts w:ascii="Arial" w:cs="Arial" w:eastAsia="Arial" w:hAnsi="Arial"/>
-          <w:sz w:val="24"/>
-          <w:szCs w:val="24"/>
-        </w:rPr>
-      </w:pPr>
-      <w:r>
-        <w:rPr>
-          <w:rtl w:val="0"/>
-        </w:rPr>
-      </w:r>
-    </w:p>
-    <w:p>
-      <w:pPr>
-        <w:ind w:left="0" w:firstLine="0"/>
-        <w:rPr>
-          <w:rFonts w:ascii="Arial" w:cs="Arial" w:eastAsia="Arial" w:hAnsi="Arial"/>
-          <w:sz w:val="24"/>
-          <w:szCs w:val="24"/>
+      <w:r>
+        <w:rPr>
           <w:highlight w:val="white"/>
-        </w:rPr>
-      </w:pPr>
-      <w:r>
-        <w:rPr>
-          <w:rFonts w:ascii="Arial" w:cs="Arial" w:eastAsia="Arial" w:hAnsi="Arial"/>
-          <w:sz w:val="24"/>
-          <w:szCs w:val="24"/>
-          <w:rtl w:val="0"/>
-        </w:rPr>
-        <w:t xml:space="preserve">Pero para implementarlo necesitamos instalar </w:t>
-      </w:r>
-      <w:r>
-        <w:rPr>
-          <w:rFonts w:ascii="Arial" w:cs="Arial" w:eastAsia="Arial" w:hAnsi="Arial"/>
-          <w:sz w:val="24"/>
-          <w:szCs w:val="24"/>
-          <w:highlight w:val="white"/>
-          <w:rtl w:val="0"/>
-        </w:rPr>
-        <w:t xml:space="preserve">react-router-dom ya que react no trae ruteo nativo,  y react-router-dom es una biblioteca estándar  de facto que implementa navegación SPA en el cliente.  Osea es lo que me permite ir de la pantalla  home a crear subasta sin tener que estar recargando la página. Y esta misma debe implementarse para comodidad del usuario. </w:t>
-        <w:br w:type="textWrapping"/>
+          <w:rtl w:val="0"/>
+        </w:rPr>
         <w:br w:type="textWrapping"/>
         <w:t xml:space="preserve">Una ves que los  instalamos los archivos en pages quedaron asi: </w:t>
         <w:br w:type="textWrapping"/>
       </w:r>
       <w:r>
         <w:rPr>
-          <w:rFonts w:ascii="Arial" w:cs="Arial" w:eastAsia="Arial" w:hAnsi="Arial"/>
-          <w:sz w:val="24"/>
-          <w:szCs w:val="24"/>
           <w:highlight w:val="white"/>
         </w:rPr>
         <w:drawing>
           <wp:inline distB="114300" distT="114300" distL="114300" distR="114300">
             <wp:extent cx="2238375" cy="2085975"/>
             <wp:effectExtent b="0" l="0" r="0" t="0"/>
-            <wp:docPr id="8" name="image1.png"/>
+            <wp:docPr id="8" name="image6.png"/>
             <a:graphic>
               <a:graphicData uri="http://schemas.openxmlformats.org/drawingml/2006/picture">
                 <pic:pic>
                   <pic:nvPicPr>
-                    <pic:cNvPr id="0" name="image1.png"/>
+                    <pic:cNvPr id="0" name="image6.png"/>
                     <pic:cNvPicPr preferRelativeResize="0"/>
                   </pic:nvPicPr>
                   <pic:blipFill>
@@ -20948,27 +20954,522 @@
       </w:r>
       <w:r>
         <w:rPr>
-          <w:rFonts w:ascii="Arial" w:cs="Arial" w:eastAsia="Arial" w:hAnsi="Arial"/>
-          <w:sz w:val="24"/>
-          <w:szCs w:val="24"/>
           <w:highlight w:val="white"/>
           <w:rtl w:val="0"/>
         </w:rPr>
         <w:br w:type="textWrapping"/>
         <w:t xml:space="preserve">Aqui ya se implemento las pantallas de Home y registro login. </w:t>
         <w:br w:type="textWrapping"/>
-      </w:r>
-    </w:p>
-    <w:p>
-      <w:pPr>
-        <w:ind w:left="0" w:firstLine="0"/>
-        <w:rPr>
-          <w:rFonts w:ascii="Arial" w:cs="Arial" w:eastAsia="Arial" w:hAnsi="Arial"/>
-          <w:sz w:val="24"/>
-          <w:szCs w:val="24"/>
+        <w:br w:type="textWrapping"/>
+        <w:t xml:space="preserve">P</w:t>
+      </w:r>
+      <w:r>
+        <w:rPr>
+          <w:rFonts w:ascii="Arial" w:cs="Arial" w:eastAsia="Arial" w:hAnsi="Arial"/>
           <w:highlight w:val="white"/>
-        </w:rPr>
-      </w:pPr>
+          <w:rtl w:val="0"/>
+        </w:rPr>
+        <w:t xml:space="preserve">roblemas en la implementación de la pantalla de wallet. </w:t>
+      </w:r>
+      <w:r>
+        <w:rPr>
+          <w:rFonts w:ascii="Arial" w:cs="Arial" w:eastAsia="Arial" w:hAnsi="Arial"/>
+          <w:b w:val="0"/>
+          <w:bCs w:val="0"/>
+          <w:sz w:val="24"/>
+          <w:szCs w:val="24"/>
+          <w:highlight w:val="white"/>
+          <w:rtl w:val="0"/>
+        </w:rPr>
+        <w:t xml:space="preserve">Paso un problema al implementar la pantalla de billetera, en mi backend todas las operaciones como venta o ingreso de dinero están definidas en una sola. operación , entonces el frontend a la hora de hacer el historial, no sabría de dónde viene el dinero. Provocando redundancia. Esto lo pude descubrir gracias a la IA. </w:t>
+      </w:r>
+    </w:p>
+    <w:p>
+      <w:pPr>
+        <w:pStyle w:val="Heading3"/>
+        <w:rPr>
+          <w:rFonts w:ascii="Arial" w:cs="Arial" w:eastAsia="Arial" w:hAnsi="Arial"/>
+          <w:b w:val="0"/>
+          <w:bCs w:val="0"/>
+          <w:sz w:val="24"/>
+          <w:szCs w:val="24"/>
+          <w:highlight w:val="white"/>
+        </w:rPr>
+      </w:pPr>
+      <w:bookmarkStart w:colFirst="0" w:colLast="0" w:name="_heading=h.vjdav6uaa2zs" w:id="87"/>
+      <w:bookmarkEnd w:id="87"/>
+      <w:r>
+        <w:rPr>
+          <w:rFonts w:ascii="Arial" w:cs="Arial" w:eastAsia="Arial" w:hAnsi="Arial"/>
+          <w:b w:val="0"/>
+          <w:bCs w:val="0"/>
+          <w:sz w:val="24"/>
+          <w:szCs w:val="24"/>
+          <w:highlight w:val="white"/>
+        </w:rPr>
+        <w:drawing>
+          <wp:inline distB="114300" distT="114300" distL="114300" distR="114300">
+            <wp:extent cx="5274000" cy="939800"/>
+            <wp:effectExtent b="0" l="0" r="0" t="0"/>
+            <wp:docPr id="13" name="image14.png"/>
+            <a:graphic>
+              <a:graphicData uri="http://schemas.openxmlformats.org/drawingml/2006/picture">
+                <pic:pic>
+                  <pic:nvPicPr>
+                    <pic:cNvPr id="0" name="image14.png"/>
+                    <pic:cNvPicPr preferRelativeResize="0"/>
+                  </pic:nvPicPr>
+                  <pic:blipFill>
+                    <a:blip r:embed="rId62"/>
+                    <a:srcRect b="0" l="0" r="0" t="0"/>
+                    <a:stretch>
+                      <a:fillRect/>
+                    </a:stretch>
+                  </pic:blipFill>
+                  <pic:spPr>
+                    <a:xfrm>
+                      <a:off x="0" y="0"/>
+                      <a:ext cx="5274000" cy="939800"/>
+                    </a:xfrm>
+                    <a:prstGeom prst="rect"/>
+                    <a:ln/>
+                  </pic:spPr>
+                </pic:pic>
+              </a:graphicData>
+            </a:graphic>
+          </wp:inline>
+        </w:drawing>
+      </w:r>
+      <w:r>
+        <w:rPr>
+          <w:rtl w:val="0"/>
+        </w:rPr>
+      </w:r>
+    </w:p>
+    <w:p>
+      <w:pPr>
+        <w:pStyle w:val="Heading3"/>
+        <w:rPr>
+          <w:rFonts w:ascii="Arial" w:cs="Arial" w:eastAsia="Arial" w:hAnsi="Arial"/>
+          <w:b w:val="0"/>
+          <w:bCs w:val="0"/>
+          <w:sz w:val="24"/>
+          <w:szCs w:val="24"/>
+          <w:highlight w:val="white"/>
+        </w:rPr>
+      </w:pPr>
+      <w:bookmarkStart w:colFirst="0" w:colLast="0" w:name="_heading=h.czyoe4qnqj8o" w:id="88"/>
+      <w:bookmarkEnd w:id="88"/>
+      <w:r>
+        <w:rPr>
+          <w:rtl w:val="0"/>
+        </w:rPr>
+      </w:r>
+    </w:p>
+    <w:p>
+      <w:pPr>
+        <w:pStyle w:val="Heading3"/>
+        <w:rPr>
+          <w:highlight w:val="white"/>
+        </w:rPr>
+      </w:pPr>
+      <w:bookmarkStart w:colFirst="0" w:colLast="0" w:name="_heading=h.7lg4a0gbjzh9" w:id="89"/>
+      <w:bookmarkEnd w:id="89"/>
+      <w:r>
+        <w:rPr>
+          <w:rtl w:val="0"/>
+        </w:rPr>
+      </w:r>
+    </w:p>
+    <w:p>
+      <w:pPr>
+        <w:pStyle w:val="Heading3"/>
+        <w:rPr>
+          <w:highlight w:val="white"/>
+        </w:rPr>
+      </w:pPr>
+      <w:bookmarkStart w:colFirst="0" w:colLast="0" w:name="_heading=h.h5gn3iii9dfs" w:id="90"/>
+      <w:bookmarkEnd w:id="90"/>
+      <w:r>
+        <w:rPr>
+          <w:highlight w:val="white"/>
+          <w:rtl w:val="0"/>
+        </w:rPr>
+        <w:br w:type="textWrapping"/>
+      </w:r>
+    </w:p>
+    <w:p>
+      <w:pPr>
+        <w:rPr/>
+      </w:pPr>
+      <w:r>
+        <w:rPr>
+          <w:rtl w:val="0"/>
+        </w:rPr>
+      </w:r>
+    </w:p>
+    <w:p>
+      <w:pPr>
+        <w:rPr/>
+      </w:pPr>
+      <w:r>
+        <w:rPr>
+          <w:rtl w:val="0"/>
+        </w:rPr>
+      </w:r>
+    </w:p>
+    <w:p>
+      <w:pPr>
+        <w:rPr/>
+      </w:pPr>
+      <w:r>
+        <w:rPr>
+          <w:rtl w:val="0"/>
+        </w:rPr>
+      </w:r>
+    </w:p>
+    <w:p>
+      <w:pPr>
+        <w:pStyle w:val="Heading2"/>
+        <w:rPr>
+          <w:rFonts w:ascii="Arial" w:cs="Arial" w:eastAsia="Arial" w:hAnsi="Arial"/>
+          <w:b w:val="0"/>
+          <w:bCs w:val="0"/>
+          <w:sz w:val="24"/>
+          <w:szCs w:val="24"/>
+        </w:rPr>
+      </w:pPr>
+      <w:bookmarkStart w:colFirst="0" w:colLast="0" w:name="_heading=h.z5u7xyr1637c" w:id="91"/>
+      <w:bookmarkEnd w:id="91"/>
+      <w:r>
+        <w:rPr>
+          <w:rtl w:val="0"/>
+        </w:rPr>
+        <w:t xml:space="preserve">Problemas de implementación en la pantalla “Crear Subasta”</w:t>
+        <w:br w:type="textWrapping"/>
+      </w:r>
+      <w:r>
+        <w:rPr>
+          <w:rFonts w:ascii="Arial" w:cs="Arial" w:eastAsia="Arial" w:hAnsi="Arial"/>
+          <w:b w:val="0"/>
+          <w:bCs w:val="0"/>
+          <w:sz w:val="24"/>
+          <w:szCs w:val="24"/>
+          <w:rtl w:val="0"/>
+        </w:rPr>
+        <w:t xml:space="preserve">Cuando creaba una subasta por ejemplo para hoy, dentro de 5 min y lo publico en la pantalla de home me aparece como próximamente y con la fecha de inicio de mañana según la  IA:</w:t>
+        <w:br w:type="textWrapping"/>
+      </w:r>
+      <w:r>
+        <w:rPr>
+          <w:rtl w:val="0"/>
+        </w:rPr>
+      </w:r>
+    </w:p>
+    <w:p>
+      <w:pPr>
+        <w:rPr>
+          <w:rFonts w:ascii="Arial" w:cs="Arial" w:eastAsia="Arial" w:hAnsi="Arial"/>
+          <w:sz w:val="24"/>
+          <w:szCs w:val="24"/>
+        </w:rPr>
+      </w:pPr>
+      <w:r>
+        <w:rPr>
+          <w:rtl w:val="0"/>
+        </w:rPr>
+      </w:r>
+    </w:p>
+    <w:p>
+      <w:pPr>
+        <w:rPr>
+          <w:rFonts w:ascii="Arial" w:cs="Arial" w:eastAsia="Arial" w:hAnsi="Arial"/>
+          <w:b w:val="1"/>
+          <w:bCs w:val="1"/>
+          <w:sz w:val="24"/>
+          <w:szCs w:val="24"/>
+        </w:rPr>
+      </w:pPr>
+      <w:r>
+        <w:rPr>
+          <w:rFonts w:ascii="Arial" w:cs="Arial" w:eastAsia="Arial" w:hAnsi="Arial"/>
+          <w:b w:val="1"/>
+          <w:bCs w:val="1"/>
+          <w:sz w:val="24"/>
+          <w:szCs w:val="24"/>
+          <w:rtl w:val="0"/>
+        </w:rPr>
+        <w:t xml:space="preserve">Consulta mia: </w:t>
+      </w:r>
+      <w:r>
+        <w:rPr>
+          <w:rtl w:val="0"/>
+        </w:rPr>
+      </w:r>
+    </w:p>
+    <w:p>
+      <w:pPr>
+        <w:pStyle w:val="Heading2"/>
+        <w:rPr>
+          <w:rFonts w:ascii="Arial" w:cs="Arial" w:eastAsia="Arial" w:hAnsi="Arial"/>
+          <w:b w:val="0"/>
+          <w:bCs w:val="0"/>
+          <w:sz w:val="24"/>
+          <w:szCs w:val="24"/>
+        </w:rPr>
+      </w:pPr>
+      <w:bookmarkStart w:colFirst="0" w:colLast="0" w:name="_heading=h.epk30cdexwe8" w:id="92"/>
+      <w:bookmarkEnd w:id="92"/>
+      <w:r>
+        <w:rPr>
+          <w:rFonts w:ascii="Arial" w:cs="Arial" w:eastAsia="Arial" w:hAnsi="Arial"/>
+          <w:b w:val="0"/>
+          <w:bCs w:val="0"/>
+          <w:sz w:val="24"/>
+          <w:szCs w:val="24"/>
+          <w:rtl w:val="0"/>
+        </w:rPr>
+        <w:t xml:space="preserve">ahora con la pantalla de  crear subasta, es un problema puntual, así que solo céntrate en la pantalla de crear subasta, para ser preciso cuando por ejemplo pongo la fecha de hoy, y que la subasta se publique en 5 min, cuando la publico  me altera la fecha de inicio para mañana  por ejemplo yo puse la fecha como 27/09/2026 23:10   pero cuando me fije en la subasta en vivo me ponía Inicia el 28/09/2026 por que pasa eso, ya despues te pediré que lo corrijas pero primero  explicame con oraciones cortas</w:t>
+      </w:r>
+    </w:p>
+    <w:p>
+      <w:pPr>
+        <w:pStyle w:val="Heading2"/>
+        <w:rPr>
+          <w:rFonts w:ascii="Arial" w:cs="Arial" w:eastAsia="Arial" w:hAnsi="Arial"/>
+          <w:sz w:val="24"/>
+          <w:szCs w:val="24"/>
+        </w:rPr>
+      </w:pPr>
+      <w:bookmarkStart w:colFirst="0" w:colLast="0" w:name="_heading=h.sd08qrt0iwfb" w:id="93"/>
+      <w:bookmarkEnd w:id="93"/>
+      <w:r>
+        <w:rPr>
+          <w:rFonts w:ascii="Arial" w:cs="Arial" w:eastAsia="Arial" w:hAnsi="Arial"/>
+          <w:sz w:val="24"/>
+          <w:szCs w:val="24"/>
+          <w:rtl w:val="0"/>
+        </w:rPr>
+        <w:t xml:space="preserve">Respuesta de la IA:</w:t>
+      </w:r>
+    </w:p>
+    <w:p>
+      <w:pPr>
+        <w:pStyle w:val="Heading2"/>
+        <w:rPr>
+          <w:rFonts w:ascii="Arial" w:cs="Arial" w:eastAsia="Arial" w:hAnsi="Arial"/>
+          <w:b w:val="0"/>
+          <w:bCs w:val="0"/>
+          <w:sz w:val="24"/>
+          <w:szCs w:val="24"/>
+        </w:rPr>
+      </w:pPr>
+      <w:bookmarkStart w:colFirst="0" w:colLast="0" w:name="_heading=h.mhcb4qz3uf5o" w:id="94"/>
+      <w:bookmarkEnd w:id="94"/>
+      <w:r>
+        <w:rPr>
+          <w:rFonts w:ascii="Arial" w:cs="Arial" w:eastAsia="Arial" w:hAnsi="Arial"/>
+          <w:b w:val="0"/>
+          <w:bCs w:val="0"/>
+          <w:sz w:val="24"/>
+          <w:szCs w:val="24"/>
+          <w:rtl w:val="0"/>
+        </w:rPr>
+        <w:t xml:space="preserve">Es un problema de zonas horarias, no de tu backend en sí. Pasos, en corto:</w:t>
+      </w:r>
+    </w:p>
+    <w:p>
+      <w:pPr>
+        <w:pStyle w:val="Heading2"/>
+        <w:rPr>
+          <w:rFonts w:ascii="Arial" w:cs="Arial" w:eastAsia="Arial" w:hAnsi="Arial"/>
+          <w:b w:val="0"/>
+          <w:bCs w:val="0"/>
+          <w:sz w:val="24"/>
+          <w:szCs w:val="24"/>
+        </w:rPr>
+      </w:pPr>
+      <w:bookmarkStart w:colFirst="0" w:colLast="0" w:name="_heading=h.q0cupc4j5zcn" w:id="95"/>
+      <w:bookmarkEnd w:id="95"/>
+      <w:r>
+        <w:rPr>
+          <w:rtl w:val="0"/>
+        </w:rPr>
+      </w:r>
+    </w:p>
+    <w:p>
+      <w:pPr>
+        <w:pStyle w:val="Heading2"/>
+        <w:rPr>
+          <w:rFonts w:ascii="Arial" w:cs="Arial" w:eastAsia="Arial" w:hAnsi="Arial"/>
+          <w:b w:val="0"/>
+          <w:bCs w:val="0"/>
+          <w:sz w:val="24"/>
+          <w:szCs w:val="24"/>
+        </w:rPr>
+      </w:pPr>
+      <w:bookmarkStart w:colFirst="0" w:colLast="0" w:name="_heading=h.1flb1ia6hw4n" w:id="96"/>
+      <w:bookmarkEnd w:id="96"/>
+      <w:r>
+        <w:rPr>
+          <w:rFonts w:ascii="Arial" w:cs="Arial" w:eastAsia="Arial" w:hAnsi="Arial"/>
+          <w:b w:val="0"/>
+          <w:bCs w:val="0"/>
+          <w:sz w:val="24"/>
+          <w:szCs w:val="24"/>
+          <w:rtl w:val="0"/>
+        </w:rPr>
+        <w:t xml:space="preserve">Tu fecha se manda como texto en hora local, pero el navegador la convierte a UTC antes de enviarla.</w:t>
+      </w:r>
+    </w:p>
+    <w:p>
+      <w:pPr>
+        <w:pStyle w:val="Heading2"/>
+        <w:rPr>
+          <w:rFonts w:ascii="Arial" w:cs="Arial" w:eastAsia="Arial" w:hAnsi="Arial"/>
+          <w:b w:val="0"/>
+          <w:bCs w:val="0"/>
+          <w:sz w:val="24"/>
+          <w:szCs w:val="24"/>
+        </w:rPr>
+      </w:pPr>
+      <w:bookmarkStart w:colFirst="0" w:colLast="0" w:name="_heading=h.ak5ovq4yhq8n" w:id="97"/>
+      <w:bookmarkEnd w:id="97"/>
+      <w:r>
+        <w:rPr>
+          <w:rFonts w:ascii="Arial" w:cs="Arial" w:eastAsia="Arial" w:hAnsi="Arial"/>
+          <w:b w:val="0"/>
+          <w:bCs w:val="0"/>
+          <w:sz w:val="24"/>
+          <w:szCs w:val="24"/>
+          <w:rtl w:val="0"/>
+        </w:rPr>
+        <w:t xml:space="preserve">Argentina está 3 horas atrás de UTC.</w:t>
+      </w:r>
+    </w:p>
+    <w:p>
+      <w:pPr>
+        <w:pStyle w:val="Heading2"/>
+        <w:rPr>
+          <w:rFonts w:ascii="Arial" w:cs="Arial" w:eastAsia="Arial" w:hAnsi="Arial"/>
+          <w:b w:val="0"/>
+          <w:bCs w:val="0"/>
+          <w:sz w:val="24"/>
+          <w:szCs w:val="24"/>
+        </w:rPr>
+      </w:pPr>
+      <w:bookmarkStart w:colFirst="0" w:colLast="0" w:name="_heading=h.vr55gebgpowu" w:id="98"/>
+      <w:bookmarkEnd w:id="98"/>
+      <w:r>
+        <w:rPr>
+          <w:rFonts w:ascii="Arial" w:cs="Arial" w:eastAsia="Arial" w:hAnsi="Arial"/>
+          <w:b w:val="0"/>
+          <w:bCs w:val="0"/>
+          <w:sz w:val="24"/>
+          <w:szCs w:val="24"/>
+          <w:rtl w:val="0"/>
+        </w:rPr>
+        <w:t xml:space="preserve">23:10 del día 27 + 3 horas = 02:10 del día 28, en UTC.</w:t>
+      </w:r>
+    </w:p>
+    <w:p>
+      <w:pPr>
+        <w:pStyle w:val="Heading2"/>
+        <w:rPr>
+          <w:rFonts w:ascii="Arial" w:cs="Arial" w:eastAsia="Arial" w:hAnsi="Arial"/>
+          <w:b w:val="0"/>
+          <w:bCs w:val="0"/>
+          <w:sz w:val="24"/>
+          <w:szCs w:val="24"/>
+        </w:rPr>
+      </w:pPr>
+      <w:bookmarkStart w:colFirst="0" w:colLast="0" w:name="_heading=h.dchbpjyf87jn" w:id="99"/>
+      <w:bookmarkEnd w:id="99"/>
+      <w:r>
+        <w:rPr>
+          <w:rFonts w:ascii="Arial" w:cs="Arial" w:eastAsia="Arial" w:hAnsi="Arial"/>
+          <w:b w:val="0"/>
+          <w:bCs w:val="0"/>
+          <w:sz w:val="24"/>
+          <w:szCs w:val="24"/>
+          <w:rtl w:val="0"/>
+        </w:rPr>
+        <w:t xml:space="preserve">El backend guarda esa hora tal cual, como si fuera hora local, sin saber que en realidad es UTC.</w:t>
+      </w:r>
+    </w:p>
+    <w:p>
+      <w:pPr>
+        <w:pStyle w:val="Heading2"/>
+        <w:rPr>
+          <w:rFonts w:ascii="Arial" w:cs="Arial" w:eastAsia="Arial" w:hAnsi="Arial"/>
+          <w:b w:val="0"/>
+          <w:bCs w:val="0"/>
+          <w:sz w:val="24"/>
+          <w:szCs w:val="24"/>
+        </w:rPr>
+      </w:pPr>
+      <w:bookmarkStart w:colFirst="0" w:colLast="0" w:name="_heading=h.vkhymvm8u59n" w:id="100"/>
+      <w:bookmarkEnd w:id="100"/>
+      <w:r>
+        <w:rPr>
+          <w:rFonts w:ascii="Arial" w:cs="Arial" w:eastAsia="Arial" w:hAnsi="Arial"/>
+          <w:b w:val="0"/>
+          <w:bCs w:val="0"/>
+          <w:sz w:val="24"/>
+          <w:szCs w:val="24"/>
+          <w:rtl w:val="0"/>
+        </w:rPr>
+        <w:t xml:space="preserve">Al mostrarla de nuevo, nadie la vuelve a convertir a hora local.</w:t>
+      </w:r>
+    </w:p>
+    <w:p>
+      <w:pPr>
+        <w:pStyle w:val="Heading2"/>
+        <w:rPr>
+          <w:rFonts w:ascii="Arial" w:cs="Arial" w:eastAsia="Arial" w:hAnsi="Arial"/>
+          <w:b w:val="0"/>
+          <w:bCs w:val="0"/>
+          <w:sz w:val="24"/>
+          <w:szCs w:val="24"/>
+        </w:rPr>
+      </w:pPr>
+      <w:bookmarkStart w:colFirst="0" w:colLast="0" w:name="_heading=h.a16lpu85bvk6" w:id="101"/>
+      <w:bookmarkEnd w:id="101"/>
+      <w:r>
+        <w:rPr>
+          <w:rFonts w:ascii="Arial" w:cs="Arial" w:eastAsia="Arial" w:hAnsi="Arial"/>
+          <w:b w:val="0"/>
+          <w:bCs w:val="0"/>
+          <w:sz w:val="24"/>
+          <w:szCs w:val="24"/>
+          <w:rtl w:val="0"/>
+        </w:rPr>
+        <w:t xml:space="preserve">Por eso ves el 28, en vez del 27.</w:t>
+      </w:r>
+    </w:p>
+    <w:p>
+      <w:pPr>
+        <w:pStyle w:val="Heading2"/>
+        <w:rPr>
+          <w:rFonts w:ascii="Arial" w:cs="Arial" w:eastAsia="Arial" w:hAnsi="Arial"/>
+          <w:sz w:val="24"/>
+          <w:szCs w:val="24"/>
+          <w:highlight w:val="white"/>
+        </w:rPr>
+      </w:pPr>
+      <w:bookmarkStart w:colFirst="0" w:colLast="0" w:name="_heading=h.u0ct83543tam" w:id="102"/>
+      <w:bookmarkEnd w:id="102"/>
+      <w:r>
+        <w:rPr>
+          <w:rFonts w:ascii="Arial" w:cs="Arial" w:eastAsia="Arial" w:hAnsi="Arial"/>
+          <w:b w:val="0"/>
+          <w:bCs w:val="0"/>
+          <w:sz w:val="24"/>
+          <w:szCs w:val="24"/>
+          <w:rtl w:val="0"/>
+        </w:rPr>
+        <w:t xml:space="preserve">Solo se nota con horas cercanas a la medianoche, por eso no lo viste antes.</w:t>
+      </w:r>
       <w:r>
         <w:rPr>
           <w:rtl w:val="0"/>
@@ -20976,9 +21477,9 @@
       </w:r>
     </w:p>
     <w:sectPr>
-      <w:headerReference r:id="rId62" w:type="default"/>
-      <w:headerReference r:id="rId63" w:type="first"/>
-      <w:footerReference r:id="rId64" w:type="default"/>
+      <w:headerReference r:id="rId63" w:type="default"/>
+      <w:headerReference r:id="rId64" w:type="first"/>
+      <w:footerReference r:id="rId65" w:type="default"/>
       <w:pgSz w:h="16838" w:w="11906" w:orient="portrait"/>
       <w:pgMar w:bottom="1440" w:top="1440" w:left="1800" w:right="1800" w:header="720" w:footer="720"/>
       <w:pgNumType w:start="0"/>
@@ -21105,8 +21606,8 @@
 
 <file path=word/commentsExtended.xml><?xml version="1.0" encoding="utf-8"?>
 <w15:commentsEx xmlns:mc="http://schemas.openxmlformats.org/markup-compatibility/2006" xmlns:o="urn:schemas-microsoft-com:office:office" xmlns:r="http://schemas.openxmlformats.org/officeDocument/2006/relationships" xmlns:m="http://schemas.openxmlformats.org/officeDocument/2006/math" xmlns:v="urn:schemas-microsoft-com:vml" xmlns:wp="http://schemas.openxmlformats.org/drawingml/2006/wordprocessingDrawing" xmlns:w10="urn:schemas-microsoft-com:office:word" xmlns:w="http://schemas.openxmlformats.org/wordprocessingml/2006/main" xmlns:wne="http://schemas.microsoft.com/office/word/2006/wordml" xmlns:sl="http://schemas.openxmlformats.org/schemaLibrary/2006/main" xmlns:a="http://schemas.openxmlformats.org/drawingml/2006/main" xmlns:pic="http://schemas.openxmlformats.org/drawingml/2006/picture" xmlns:c="http://schemas.openxmlformats.org/drawingml/2006/chart" xmlns:lc="http://schemas.openxmlformats.org/drawingml/2006/lockedCanvas" xmlns:dgm="http://schemas.openxmlformats.org/drawingml/2006/diagram" xmlns:wps="http://schemas.microsoft.com/office/word/2010/wordprocessingShape" xmlns:wpg="http://schemas.microsoft.com/office/word/2010/wordprocessingGroup" xmlns:w14="http://schemas.microsoft.com/office/word/2010/wordml" xmlns:w15="http://schemas.microsoft.com/office/word/2012/wordml" xmlns:w16="http://schemas.microsoft.com/office/word/2018/wordml" xmlns:w16cex="http://schemas.microsoft.com/office/word/2018/wordml/cex" xmlns:w16cid="http://schemas.microsoft.com/office/word/2016/wordml/cid" xmlns="http://schemas.microsoft.com/office/tasks/2019/documenttasks" xmlns:cr="http://schemas.microsoft.com/office/comments/2020/reactions">
-  <w15:commentEx w15:paraId="00000325" w15:done="0"/>
-  <w15:commentEx w15:paraId="00000326" w15:paraIdParent="00000325" w15:done="0"/>
+  <w15:commentEx w15:paraId="00000338" w15:done="0"/>
+  <w15:commentEx w15:paraId="00000339" w15:paraIdParent="00000338" w15:done="0"/>
 </w15:commentsEx>
 </file>
 
@@ -24219,7 +24720,7 @@
 
 <file path=customXML/item1.xml><?xml version="1.0" encoding="utf-8"?>
 <go:gDocsCustomXmlDataStorage xmlns:go="http://customooxmlschemas.google.com/" xmlns:r="http://schemas.openxmlformats.org/officeDocument/2006/relationships" uri="GoogleDocsCustomDataVersion2">
-  <go:docsCustomData xmlns:go="http://customooxmlschemas.google.com/" roundtripDataSignature="AMtx7mjTTr1kuQAuIxVgYs1/XAs/bZrx0g==">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</go:docsCustomData>
+  <go:docsCustomData xmlns:go="http://customooxmlschemas.google.com/" roundtripDataSignature="AMtx7mimhVUW7WpO10Ts/wcPB8PfJP+EQA==">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</go:docsCustomData>
 </go:gDocsCustomXmlDataStorage>
 </file>
 

</xml_diff>